<commit_message>
Update Wage-Climate Elasticity Notes.docx
</commit_message>
<xml_diff>
--- a/Wage-Climate Elasticity Notes.docx
+++ b/Wage-Climate Elasticity Notes.docx
@@ -3,6 +3,9 @@
 <w:document xmlns:wpc="http://schemas.microsoft.com/office/word/2010/wordprocessingCanvas" xmlns:cx="http://schemas.microsoft.com/office/drawing/2014/chartex" xmlns:cx1="http://schemas.microsoft.com/office/drawing/2015/9/8/chartex" xmlns:cx2="http://schemas.microsoft.com/office/drawing/2015/10/21/chartex" xmlns:cx3="http://schemas.microsoft.com/office/drawing/2016/5/9/chartex" xmlns:cx4="http://schemas.microsoft.com/office/drawing/2016/5/10/chartex" xmlns:cx5="http://schemas.microsoft.com/office/drawing/2016/5/11/chartex" xmlns:cx6="http://schemas.microsoft.com/office/drawing/2016/5/12/chartex" xmlns:cx7="http://schemas.microsoft.com/office/drawing/2016/5/13/chartex" xmlns:cx8="http://schemas.microsoft.com/office/drawing/2016/5/14/chartex" xmlns:mc="http://schemas.openxmlformats.org/markup-compatibility/2006" xmlns:aink="http://schemas.microsoft.com/office/drawing/2016/ink" xmlns:am3d="http://schemas.microsoft.com/office/drawing/2017/model3d" xmlns:o="urn:schemas-microsoft-com:office:office" xmlns:oel="http://schemas.microsoft.com/office/2019/extlst" xmlns:r="http://schemas.openxmlformats.org/officeDocument/2006/relationships" xmlns:m="http://schemas.openxmlformats.org/officeDocument/2006/math" xmlns:v="urn:schemas-microsoft-com:vml" xmlns:wp14="http://schemas.microsoft.com/office/word/2010/wordprocessingDrawing" xmlns:wp="http://schemas.openxmlformats.org/drawingml/2006/wordprocessingDrawing" xmlns:w10="urn:schemas-microsoft-com:office:word" xmlns:w="http://schemas.openxmlformats.org/wordprocessingml/2006/main" xmlns:w14="http://schemas.microsoft.com/office/word/2010/wordml" xmlns:w15="http://schemas.microsoft.com/office/word/2012/wordml" xmlns:w16cex="http://schemas.microsoft.com/office/word/2018/wordml/cex" xmlns:w16cid="http://schemas.microsoft.com/office/word/2016/wordml/cid" xmlns:w16="http://schemas.microsoft.com/office/word/2018/wordml" xmlns:w16du="http://schemas.microsoft.com/office/word/2023/wordml/word16du" xmlns:w16sdtdh="http://schemas.microsoft.com/office/word/2020/wordml/sdtdatahash" xmlns:w16sdtfl="http://schemas.microsoft.com/office/word/2024/wordml/sdtformatlock" xmlns:w16se="http://schemas.microsoft.com/office/word/2015/wordml/symex" xmlns:wpg="http://schemas.microsoft.com/office/word/2010/wordprocessingGroup" xmlns:wpi="http://schemas.microsoft.com/office/word/2010/wordprocessingInk" xmlns:wne="http://schemas.microsoft.com/office/word/2006/wordml" xmlns:wps="http://schemas.microsoft.com/office/word/2010/wordprocessingShape" mc:Ignorable="w14 w15 w16se w16cid w16 w16cex w16sdtdh w16sdtfl w16du wp14">
   <w:body>
     <w:p>
+      <w:pPr>
+        <w:pStyle w:val="Heading1"/>
+      </w:pPr>
       <w:r>
         <w:t>Introduction:</w:t>
       </w:r>
@@ -17,15 +20,7 @@
         <w:jc w:val="both"/>
       </w:pPr>
       <w:r>
-        <w:t xml:space="preserve">The agricultural labor market is </w:t>
-      </w:r>
-      <w:proofErr w:type="gramStart"/>
-      <w:r>
-        <w:t>effected</w:t>
-      </w:r>
-      <w:proofErr w:type="gramEnd"/>
-      <w:r>
-        <w:t xml:space="preserve"> by more than just market forces</w:t>
+        <w:t>The agricultural labor market is effected by more than just market forces</w:t>
       </w:r>
     </w:p>
     <w:p>
@@ -142,28 +137,656 @@
         <w:t xml:space="preserve"> Weather Anomalies/Climate</w:t>
       </w:r>
     </w:p>
+    <w:p>
+      <w:pPr>
+        <w:pStyle w:val="Heading1"/>
+      </w:pPr>
+      <w:r>
+        <w:t>Theory and Concepts:</w:t>
+      </w:r>
+    </w:p>
+    <w:p>
+      <w:pPr>
+        <w:pStyle w:val="ListParagraph"/>
+        <w:numPr>
+          <w:ilvl w:val="0"/>
+          <w:numId w:val="2"/>
+        </w:numPr>
+        <w:spacing w:after="0"/>
+        <w:rPr>
+          <w:rFonts w:ascii="Arial" w:hAnsi="Arial" w:cs="Arial"/>
+        </w:rPr>
+      </w:pPr>
+      <w:r>
+        <w:rPr>
+          <w:rFonts w:ascii="Arial" w:hAnsi="Arial" w:cs="Arial"/>
+          <w:b/>
+          <w:bCs/>
+        </w:rPr>
+        <w:t>Climate Wage Risk</w:t>
+      </w:r>
+      <w:r>
+        <w:rPr>
+          <w:rFonts w:ascii="Arial" w:hAnsi="Arial" w:cs="Arial"/>
+        </w:rPr>
+        <w:t>: Sensitivity and variability of agricultural wages to climate shocks.</w:t>
+      </w:r>
+    </w:p>
+    <w:p>
+      <w:pPr>
+        <w:pStyle w:val="ListParagraph"/>
+        <w:numPr>
+          <w:ilvl w:val="0"/>
+          <w:numId w:val="2"/>
+        </w:numPr>
+        <w:spacing w:after="0"/>
+        <w:rPr>
+          <w:rFonts w:ascii="Arial" w:hAnsi="Arial" w:cs="Arial"/>
+        </w:rPr>
+      </w:pPr>
+      <w:r>
+        <w:rPr>
+          <w:rFonts w:ascii="Arial" w:hAnsi="Arial" w:cs="Arial"/>
+          <w:b/>
+          <w:bCs/>
+        </w:rPr>
+        <w:t>Wage Elasticity</w:t>
+      </w:r>
+      <w:r>
+        <w:rPr>
+          <w:rFonts w:ascii="Arial" w:hAnsi="Arial" w:cs="Arial"/>
+        </w:rPr>
+        <w:t>: How responsive wages are to external changes (e.g., weather or production).</w:t>
+      </w:r>
+    </w:p>
+    <w:p>
+      <w:pPr>
+        <w:pStyle w:val="ListParagraph"/>
+        <w:numPr>
+          <w:ilvl w:val="0"/>
+          <w:numId w:val="2"/>
+        </w:numPr>
+        <w:spacing w:after="0"/>
+        <w:rPr>
+          <w:rFonts w:ascii="Arial" w:hAnsi="Arial" w:cs="Arial"/>
+        </w:rPr>
+      </w:pPr>
+      <w:r>
+        <w:rPr>
+          <w:rFonts w:ascii="Arial" w:hAnsi="Arial" w:cs="Arial"/>
+          <w:b/>
+          <w:bCs/>
+        </w:rPr>
+        <w:t>Volatility</w:t>
+      </w:r>
+      <w:r>
+        <w:rPr>
+          <w:rFonts w:ascii="Arial" w:hAnsi="Arial" w:cs="Arial"/>
+        </w:rPr>
+        <w:t>: Standard deviation or CV of wages over time as an indicator of stability.</w:t>
+      </w:r>
+    </w:p>
+    <w:p>
+      <w:pPr>
+        <w:pStyle w:val="ListParagraph"/>
+        <w:numPr>
+          <w:ilvl w:val="0"/>
+          <w:numId w:val="2"/>
+        </w:numPr>
+        <w:spacing w:after="0"/>
+        <w:rPr>
+          <w:rFonts w:ascii="Arial" w:hAnsi="Arial" w:cs="Arial"/>
+        </w:rPr>
+      </w:pPr>
+      <w:r>
+        <w:rPr>
+          <w:rFonts w:ascii="Arial" w:hAnsi="Arial" w:cs="Arial"/>
+          <w:b/>
+          <w:bCs/>
+        </w:rPr>
+        <w:t>Crop Labor Intensity</w:t>
+      </w:r>
+      <w:r>
+        <w:rPr>
+          <w:rFonts w:ascii="Arial" w:hAnsi="Arial" w:cs="Arial"/>
+        </w:rPr>
+        <w:t>: Certain crops require more manual labor → more vulnerable to shocks.</w:t>
+      </w:r>
+    </w:p>
+    <w:p>
+      <w:pPr>
+        <w:pStyle w:val="ListParagraph"/>
+        <w:numPr>
+          <w:ilvl w:val="0"/>
+          <w:numId w:val="2"/>
+        </w:numPr>
+        <w:spacing w:after="0"/>
+        <w:rPr>
+          <w:rFonts w:ascii="Arial" w:hAnsi="Arial" w:cs="Arial"/>
+        </w:rPr>
+      </w:pPr>
+      <w:r>
+        <w:rPr>
+          <w:rFonts w:ascii="Arial" w:hAnsi="Arial" w:cs="Arial"/>
+          <w:b/>
+          <w:bCs/>
+        </w:rPr>
+        <w:t>Rural Economic Spillovers</w:t>
+      </w:r>
+      <w:r>
+        <w:rPr>
+          <w:rFonts w:ascii="Arial" w:hAnsi="Arial" w:cs="Arial"/>
+        </w:rPr>
+        <w:t>: Wage changes in ag can affect or mirror trends in other sectors.</w:t>
+      </w:r>
+    </w:p>
+    <w:p>
+      <w:pPr>
+        <w:pStyle w:val="ListParagraph"/>
+        <w:numPr>
+          <w:ilvl w:val="0"/>
+          <w:numId w:val="2"/>
+        </w:numPr>
+        <w:spacing w:after="0"/>
+        <w:rPr>
+          <w:rFonts w:ascii="Arial" w:hAnsi="Arial" w:cs="Arial"/>
+        </w:rPr>
+      </w:pPr>
+      <w:r>
+        <w:rPr>
+          <w:rFonts w:ascii="Arial" w:hAnsi="Arial" w:cs="Arial"/>
+          <w:b/>
+          <w:bCs/>
+        </w:rPr>
+        <w:t>Resilience Factors</w:t>
+      </w:r>
+      <w:r>
+        <w:rPr>
+          <w:rFonts w:ascii="Arial" w:hAnsi="Arial" w:cs="Arial"/>
+        </w:rPr>
+        <w:t>: Irrigation, subsidies, mechanization may mitigate climate sensitivity.</w:t>
+      </w:r>
+    </w:p>
+    <w:p>
+      <w:pPr>
+        <w:pStyle w:val="Heading1"/>
+      </w:pPr>
+      <w:r>
+        <w:t>Modeling &amp; Analysis Techniques</w:t>
+      </w:r>
+    </w:p>
+    <w:p>
+      <w:pPr>
+        <w:pStyle w:val="ListParagraph"/>
+        <w:numPr>
+          <w:ilvl w:val="0"/>
+          <w:numId w:val="3"/>
+        </w:numPr>
+      </w:pPr>
+      <w:r>
+        <w:rPr>
+          <w:b/>
+          <w:bCs/>
+        </w:rPr>
+        <w:t>Descriptive Analysis:</w:t>
+      </w:r>
+      <w:r>
+        <w:t xml:space="preserve"> Mean, CV of wages by crop type, region, and year.</w:t>
+      </w:r>
+    </w:p>
+    <w:p>
+      <w:pPr>
+        <w:pStyle w:val="ListParagraph"/>
+        <w:numPr>
+          <w:ilvl w:val="0"/>
+          <w:numId w:val="3"/>
+        </w:numPr>
+      </w:pPr>
+      <w:r>
+        <w:rPr>
+          <w:b/>
+          <w:bCs/>
+        </w:rPr>
+        <w:t>Climate Anomaly Construction:</w:t>
+      </w:r>
+      <w:r>
+        <w:t xml:space="preserve"> Z-scores or SD deviations from historical climate baselines.</w:t>
+      </w:r>
+    </w:p>
+    <w:p>
+      <w:pPr>
+        <w:pStyle w:val="ListParagraph"/>
+        <w:numPr>
+          <w:ilvl w:val="0"/>
+          <w:numId w:val="3"/>
+        </w:numPr>
+      </w:pPr>
+      <w:r>
+        <w:rPr>
+          <w:b/>
+          <w:bCs/>
+        </w:rPr>
+        <w:t>Panel Regression:</w:t>
+      </w:r>
+      <w:r>
+        <w:t xml:space="preserve"> County and year fixed effects for wage ~ climate + crop + policy covariates.</w:t>
+      </w:r>
+    </w:p>
+    <w:p>
+      <w:pPr>
+        <w:pStyle w:val="ListParagraph"/>
+        <w:numPr>
+          <w:ilvl w:val="0"/>
+          <w:numId w:val="3"/>
+        </w:numPr>
+      </w:pPr>
+      <w:r>
+        <w:rPr>
+          <w:b/>
+          <w:bCs/>
+        </w:rPr>
+        <w:t>Interaction Terms:</w:t>
+      </w:r>
+      <w:r>
+        <w:t xml:space="preserve"> Climate × crop type, or drought × region.</w:t>
+      </w:r>
+    </w:p>
+    <w:p>
+      <w:pPr>
+        <w:pStyle w:val="ListParagraph"/>
+        <w:numPr>
+          <w:ilvl w:val="0"/>
+          <w:numId w:val="3"/>
+        </w:numPr>
+      </w:pPr>
+      <w:r>
+        <w:rPr>
+          <w:b/>
+          <w:bCs/>
+        </w:rPr>
+        <w:t>Geographically Weighted Regression (GWR):</w:t>
+      </w:r>
+      <w:r>
+        <w:t xml:space="preserve"> Spatial heterogeneity in wage–climate links.</w:t>
+      </w:r>
+    </w:p>
+    <w:p>
+      <w:pPr>
+        <w:pStyle w:val="ListParagraph"/>
+        <w:numPr>
+          <w:ilvl w:val="0"/>
+          <w:numId w:val="3"/>
+        </w:numPr>
+      </w:pPr>
+      <w:r>
+        <w:rPr>
+          <w:b/>
+          <w:bCs/>
+        </w:rPr>
+        <w:t>Hotspot Analysis / LISA / Moran’s I:</w:t>
+      </w:r>
+      <w:r>
+        <w:t xml:space="preserve"> Spatial clustering of wage shocks or variability.</w:t>
+      </w:r>
+    </w:p>
+    <w:p>
+      <w:pPr>
+        <w:pStyle w:val="ListParagraph"/>
+        <w:numPr>
+          <w:ilvl w:val="0"/>
+          <w:numId w:val="3"/>
+        </w:numPr>
+      </w:pPr>
+      <w:r>
+        <w:rPr>
+          <w:b/>
+          <w:bCs/>
+        </w:rPr>
+        <w:t xml:space="preserve">Lag Models: </w:t>
+      </w:r>
+      <w:r>
+        <w:t>t-1 climate variables → t wage outcomes.</w:t>
+      </w:r>
+    </w:p>
+    <w:p>
+      <w:pPr>
+        <w:rPr>
+          <w:b/>
+          <w:bCs/>
+        </w:rPr>
+      </w:pPr>
+      <w:r>
+        <w:rPr>
+          <w:b/>
+          <w:bCs/>
+        </w:rPr>
+        <w:t>Technical Tools &amp; Code Elements</w:t>
+      </w:r>
+    </w:p>
+    <w:p>
+      <w:pPr>
+        <w:numPr>
+          <w:ilvl w:val="0"/>
+          <w:numId w:val="4"/>
+        </w:numPr>
+      </w:pPr>
+      <w:r>
+        <w:rPr>
+          <w:b/>
+          <w:bCs/>
+        </w:rPr>
+        <w:t>NASS API Pipeline (Python)</w:t>
+      </w:r>
+      <w:r>
+        <w:t>:</w:t>
+      </w:r>
+    </w:p>
+    <w:p>
+      <w:pPr>
+        <w:numPr>
+          <w:ilvl w:val="1"/>
+          <w:numId w:val="4"/>
+        </w:numPr>
+      </w:pPr>
+      <w:proofErr w:type="spellStart"/>
+      <w:r>
+        <w:lastRenderedPageBreak/>
+        <w:t>get_available_parameters</w:t>
+      </w:r>
+      <w:proofErr w:type="spellEnd"/>
+      <w:r>
+        <w:t>()</w:t>
+      </w:r>
+    </w:p>
+    <w:p>
+      <w:pPr>
+        <w:numPr>
+          <w:ilvl w:val="1"/>
+          <w:numId w:val="4"/>
+        </w:numPr>
+      </w:pPr>
+      <w:proofErr w:type="spellStart"/>
+      <w:r>
+        <w:t>save_options_report</w:t>
+      </w:r>
+      <w:proofErr w:type="spellEnd"/>
+      <w:r>
+        <w:t>()</w:t>
+      </w:r>
+    </w:p>
+    <w:p>
+      <w:pPr>
+        <w:numPr>
+          <w:ilvl w:val="1"/>
+          <w:numId w:val="4"/>
+        </w:numPr>
+      </w:pPr>
+      <w:proofErr w:type="spellStart"/>
+      <w:r>
+        <w:t>run_core_variable_reports</w:t>
+      </w:r>
+      <w:proofErr w:type="spellEnd"/>
+      <w:r>
+        <w:t>()</w:t>
+      </w:r>
+    </w:p>
+    <w:p>
+      <w:pPr>
+        <w:numPr>
+          <w:ilvl w:val="0"/>
+          <w:numId w:val="4"/>
+        </w:numPr>
+      </w:pPr>
+      <w:r>
+        <w:rPr>
+          <w:b/>
+          <w:bCs/>
+        </w:rPr>
+        <w:t>QCEW Ingestion</w:t>
+      </w:r>
+      <w:r>
+        <w:t>:</w:t>
+      </w:r>
+    </w:p>
+    <w:p>
+      <w:pPr>
+        <w:numPr>
+          <w:ilvl w:val="1"/>
+          <w:numId w:val="4"/>
+        </w:numPr>
+      </w:pPr>
+      <w:r>
+        <w:t>Downloaded as .csv from BLS QCEW Data Viewer (or FTP access).</w:t>
+      </w:r>
+    </w:p>
+    <w:p>
+      <w:pPr>
+        <w:numPr>
+          <w:ilvl w:val="1"/>
+          <w:numId w:val="4"/>
+        </w:numPr>
+      </w:pPr>
+      <w:r>
+        <w:t>Merge by county-year (FIPS codes).</w:t>
+      </w:r>
+    </w:p>
+    <w:p>
+      <w:pPr>
+        <w:numPr>
+          <w:ilvl w:val="0"/>
+          <w:numId w:val="4"/>
+        </w:numPr>
+      </w:pPr>
+      <w:r>
+        <w:rPr>
+          <w:b/>
+          <w:bCs/>
+        </w:rPr>
+        <w:t>Climate Integration</w:t>
+      </w:r>
+      <w:r>
+        <w:t>:</w:t>
+      </w:r>
+    </w:p>
+    <w:p>
+      <w:pPr>
+        <w:numPr>
+          <w:ilvl w:val="1"/>
+          <w:numId w:val="4"/>
+        </w:numPr>
+      </w:pPr>
+      <w:r>
+        <w:t>Use PRISM/NOAA gridded data, spatial join or raster extraction to county centroids or polygons.</w:t>
+      </w:r>
+    </w:p>
+    <w:p>
+      <w:pPr>
+        <w:numPr>
+          <w:ilvl w:val="0"/>
+          <w:numId w:val="4"/>
+        </w:numPr>
+      </w:pPr>
+      <w:proofErr w:type="spellStart"/>
+      <w:r>
+        <w:rPr>
+          <w:b/>
+          <w:bCs/>
+        </w:rPr>
+        <w:t>GeoData</w:t>
+      </w:r>
+      <w:proofErr w:type="spellEnd"/>
+      <w:r>
+        <w:rPr>
+          <w:b/>
+          <w:bCs/>
+        </w:rPr>
+        <w:t xml:space="preserve"> Processing</w:t>
+      </w:r>
+      <w:r>
+        <w:t>:</w:t>
+      </w:r>
+    </w:p>
+    <w:p>
+      <w:pPr>
+        <w:numPr>
+          <w:ilvl w:val="1"/>
+          <w:numId w:val="4"/>
+        </w:numPr>
+      </w:pPr>
+      <w:r>
+        <w:t xml:space="preserve">Use </w:t>
+      </w:r>
+      <w:proofErr w:type="spellStart"/>
+      <w:r>
+        <w:t>GeoPandas</w:t>
+      </w:r>
+      <w:proofErr w:type="spellEnd"/>
+      <w:r>
+        <w:t xml:space="preserve"> for joins, Shapely for spatial filters, and </w:t>
+      </w:r>
+      <w:proofErr w:type="spellStart"/>
+      <w:r>
+        <w:t>PySAL</w:t>
+      </w:r>
+      <w:proofErr w:type="spellEnd"/>
+      <w:r>
+        <w:t xml:space="preserve"> for spatial econometrics.</w:t>
+      </w:r>
+    </w:p>
+    <w:p>
+      <w:pPr>
+        <w:rPr>
+          <w:b/>
+          <w:bCs/>
+        </w:rPr>
+      </w:pPr>
+      <w:r>
+        <w:rPr>
+          <w:b/>
+          <w:bCs/>
+        </w:rPr>
+        <w:t>Key Concepts and Variables (Index)</w:t>
+      </w:r>
+    </w:p>
+    <w:p>
+      <w:pPr>
+        <w:numPr>
+          <w:ilvl w:val="0"/>
+          <w:numId w:val="5"/>
+        </w:numPr>
+      </w:pPr>
+      <w:r>
+        <w:t>CLIMATE_WAGE_RISK</w:t>
+      </w:r>
+    </w:p>
+    <w:p>
+      <w:pPr>
+        <w:numPr>
+          <w:ilvl w:val="0"/>
+          <w:numId w:val="5"/>
+        </w:numPr>
+      </w:pPr>
+      <w:r>
+        <w:t>WAGE_VOLATILITY_INDEX</w:t>
+      </w:r>
+    </w:p>
+    <w:p>
+      <w:pPr>
+        <w:numPr>
+          <w:ilvl w:val="0"/>
+          <w:numId w:val="5"/>
+        </w:numPr>
+      </w:pPr>
+      <w:r>
+        <w:t>CROP_INTENSITY_SCORE</w:t>
+      </w:r>
+    </w:p>
+    <w:p>
+      <w:pPr>
+        <w:numPr>
+          <w:ilvl w:val="0"/>
+          <w:numId w:val="5"/>
+        </w:numPr>
+      </w:pPr>
+      <w:r>
+        <w:t>PRECIP_ANOMALY, TEMP_ANOMALY, DROUGHT_INDEX</w:t>
+      </w:r>
+    </w:p>
+    <w:p>
+      <w:pPr>
+        <w:numPr>
+          <w:ilvl w:val="0"/>
+          <w:numId w:val="5"/>
+        </w:numPr>
+      </w:pPr>
+      <w:r>
+        <w:t>AG_WAGE, NONAG_WAGE, WAGE_ELASTICITY</w:t>
+      </w:r>
+    </w:p>
+    <w:p>
+      <w:pPr>
+        <w:numPr>
+          <w:ilvl w:val="0"/>
+          <w:numId w:val="5"/>
+        </w:numPr>
+      </w:pPr>
+      <w:r>
+        <w:t>FIPS, NAICS, ACREAGE, YIELD, PRODUCTION_VALUE</w:t>
+      </w:r>
+    </w:p>
+    <w:p>
+      <w:pPr>
+        <w:numPr>
+          <w:ilvl w:val="0"/>
+          <w:numId w:val="5"/>
+        </w:numPr>
+      </w:pPr>
+      <w:r>
+        <w:t>GWR, PANEL_FE, LISA, MORAN_I, SPATIAL_LAG</w:t>
+      </w:r>
+    </w:p>
     <w:p/>
     <w:p>
-      <w:r>
-        <w:t xml:space="preserve">Area planted, Area </w:t>
-      </w:r>
-      <w:r>
-        <w:t>H</w:t>
-      </w:r>
-      <w:r>
-        <w:t>arvested</w:t>
-      </w:r>
-      <w:r>
-        <w:t>: (Acres, BU),</w:t>
-      </w:r>
-      <w:r>
-        <w:t xml:space="preserve"> </w:t>
-      </w:r>
-    </w:p>
-    <w:p>
-      <w:r>
-        <w:t>Sales (BU, $)</w:t>
-      </w:r>
+      <w:pPr>
+        <w:pStyle w:val="Heading1"/>
+      </w:pPr>
+      <w:r>
+        <w:t>NASS Quick Stats Data</w:t>
+      </w:r>
+    </w:p>
+    <w:p>
+      <w:pPr>
+        <w:pStyle w:val="ListParagraph"/>
+        <w:numPr>
+          <w:ilvl w:val="0"/>
+          <w:numId w:val="1"/>
+        </w:numPr>
+      </w:pPr>
+      <w:proofErr w:type="spellStart"/>
+      <w:r>
+        <w:t>land_use</w:t>
+      </w:r>
+      <w:proofErr w:type="spellEnd"/>
+      <w:r>
+        <w:t xml:space="preserve">: Area planted, Area Harvested: (Acres, BU), </w:t>
+      </w:r>
+    </w:p>
+    <w:p>
+      <w:pPr>
+        <w:pStyle w:val="ListParagraph"/>
+        <w:numPr>
+          <w:ilvl w:val="0"/>
+          <w:numId w:val="1"/>
+        </w:numPr>
+      </w:pPr>
+      <w:r>
+        <w:t>supply: Sales (BU, $)</w:t>
+      </w:r>
+    </w:p>
+    <w:p>
+      <w:pPr>
+        <w:ind w:left="360"/>
+      </w:pPr>
     </w:p>
     <w:sectPr>
       <w:pgSz w:w="12240" w:h="15840"/>
@@ -178,9 +801,158 @@
 <file path=word/numbering.xml><?xml version="1.0" encoding="utf-8"?>
 <w:numbering xmlns:wpc="http://schemas.microsoft.com/office/word/2010/wordprocessingCanvas" xmlns:cx="http://schemas.microsoft.com/office/drawing/2014/chartex" xmlns:cx1="http://schemas.microsoft.com/office/drawing/2015/9/8/chartex" xmlns:cx2="http://schemas.microsoft.com/office/drawing/2015/10/21/chartex" xmlns:cx3="http://schemas.microsoft.com/office/drawing/2016/5/9/chartex" xmlns:cx4="http://schemas.microsoft.com/office/drawing/2016/5/10/chartex" xmlns:cx5="http://schemas.microsoft.com/office/drawing/2016/5/11/chartex" xmlns:cx6="http://schemas.microsoft.com/office/drawing/2016/5/12/chartex" xmlns:cx7="http://schemas.microsoft.com/office/drawing/2016/5/13/chartex" xmlns:cx8="http://schemas.microsoft.com/office/drawing/2016/5/14/chartex" xmlns:mc="http://schemas.openxmlformats.org/markup-compatibility/2006" xmlns:aink="http://schemas.microsoft.com/office/drawing/2016/ink" xmlns:am3d="http://schemas.microsoft.com/office/drawing/2017/model3d" xmlns:o="urn:schemas-microsoft-com:office:office" xmlns:oel="http://schemas.microsoft.com/office/2019/extlst" xmlns:r="http://schemas.openxmlformats.org/officeDocument/2006/relationships" xmlns:m="http://schemas.openxmlformats.org/officeDocument/2006/math" xmlns:v="urn:schemas-microsoft-com:vml" xmlns:wp14="http://schemas.microsoft.com/office/word/2010/wordprocessingDrawing" xmlns:wp="http://schemas.openxmlformats.org/drawingml/2006/wordprocessingDrawing" xmlns:w10="urn:schemas-microsoft-com:office:word" xmlns:w="http://schemas.openxmlformats.org/wordprocessingml/2006/main" xmlns:w14="http://schemas.microsoft.com/office/word/2010/wordml" xmlns:w15="http://schemas.microsoft.com/office/word/2012/wordml" xmlns:w16cex="http://schemas.microsoft.com/office/word/2018/wordml/cex" xmlns:w16cid="http://schemas.microsoft.com/office/word/2016/wordml/cid" xmlns:w16="http://schemas.microsoft.com/office/word/2018/wordml" xmlns:w16du="http://schemas.microsoft.com/office/word/2023/wordml/word16du" xmlns:w16sdtdh="http://schemas.microsoft.com/office/word/2020/wordml/sdtdatahash" xmlns:w16sdtfl="http://schemas.microsoft.com/office/word/2024/wordml/sdtformatlock" xmlns:w16se="http://schemas.microsoft.com/office/word/2015/wordml/symex" xmlns:wpg="http://schemas.microsoft.com/office/word/2010/wordprocessingGroup" xmlns:wpi="http://schemas.microsoft.com/office/word/2010/wordprocessingInk" xmlns:wne="http://schemas.microsoft.com/office/word/2006/wordml" xmlns:wps="http://schemas.microsoft.com/office/word/2010/wordprocessingShape" mc:Ignorable="w14 w15 w16se w16cid w16 w16cex w16sdtdh w16sdtfl w16du wp14">
   <w:abstractNum w:abstractNumId="0" w15:restartNumberingAfterBreak="0">
+    <w:nsid w:val="17B1241C"/>
+    <w:multiLevelType w:val="multilevel"/>
+    <w:tmpl w:val="EEFA73E8"/>
+    <w:lvl w:ilvl="0">
+      <w:start w:val="1"/>
+      <w:numFmt w:val="bullet"/>
+      <w:lvlText w:val=""/>
+      <w:lvlJc w:val="left"/>
+      <w:pPr>
+        <w:tabs>
+          <w:tab w:val="num" w:pos="720"/>
+        </w:tabs>
+        <w:ind w:left="720" w:hanging="360"/>
+      </w:pPr>
+      <w:rPr>
+        <w:rFonts w:ascii="Symbol" w:hAnsi="Symbol" w:hint="default"/>
+        <w:sz w:val="20"/>
+      </w:rPr>
+    </w:lvl>
+    <w:lvl w:ilvl="1" w:tentative="1">
+      <w:start w:val="1"/>
+      <w:numFmt w:val="bullet"/>
+      <w:lvlText w:val="o"/>
+      <w:lvlJc w:val="left"/>
+      <w:pPr>
+        <w:tabs>
+          <w:tab w:val="num" w:pos="1440"/>
+        </w:tabs>
+        <w:ind w:left="1440" w:hanging="360"/>
+      </w:pPr>
+      <w:rPr>
+        <w:rFonts w:ascii="Courier New" w:hAnsi="Courier New" w:hint="default"/>
+        <w:sz w:val="20"/>
+      </w:rPr>
+    </w:lvl>
+    <w:lvl w:ilvl="2" w:tentative="1">
+      <w:start w:val="1"/>
+      <w:numFmt w:val="bullet"/>
+      <w:lvlText w:val=""/>
+      <w:lvlJc w:val="left"/>
+      <w:pPr>
+        <w:tabs>
+          <w:tab w:val="num" w:pos="2160"/>
+        </w:tabs>
+        <w:ind w:left="2160" w:hanging="360"/>
+      </w:pPr>
+      <w:rPr>
+        <w:rFonts w:ascii="Wingdings" w:hAnsi="Wingdings" w:hint="default"/>
+        <w:sz w:val="20"/>
+      </w:rPr>
+    </w:lvl>
+    <w:lvl w:ilvl="3" w:tentative="1">
+      <w:start w:val="1"/>
+      <w:numFmt w:val="bullet"/>
+      <w:lvlText w:val=""/>
+      <w:lvlJc w:val="left"/>
+      <w:pPr>
+        <w:tabs>
+          <w:tab w:val="num" w:pos="2880"/>
+        </w:tabs>
+        <w:ind w:left="2880" w:hanging="360"/>
+      </w:pPr>
+      <w:rPr>
+        <w:rFonts w:ascii="Wingdings" w:hAnsi="Wingdings" w:hint="default"/>
+        <w:sz w:val="20"/>
+      </w:rPr>
+    </w:lvl>
+    <w:lvl w:ilvl="4" w:tentative="1">
+      <w:start w:val="1"/>
+      <w:numFmt w:val="bullet"/>
+      <w:lvlText w:val=""/>
+      <w:lvlJc w:val="left"/>
+      <w:pPr>
+        <w:tabs>
+          <w:tab w:val="num" w:pos="3600"/>
+        </w:tabs>
+        <w:ind w:left="3600" w:hanging="360"/>
+      </w:pPr>
+      <w:rPr>
+        <w:rFonts w:ascii="Wingdings" w:hAnsi="Wingdings" w:hint="default"/>
+        <w:sz w:val="20"/>
+      </w:rPr>
+    </w:lvl>
+    <w:lvl w:ilvl="5" w:tentative="1">
+      <w:start w:val="1"/>
+      <w:numFmt w:val="bullet"/>
+      <w:lvlText w:val=""/>
+      <w:lvlJc w:val="left"/>
+      <w:pPr>
+        <w:tabs>
+          <w:tab w:val="num" w:pos="4320"/>
+        </w:tabs>
+        <w:ind w:left="4320" w:hanging="360"/>
+      </w:pPr>
+      <w:rPr>
+        <w:rFonts w:ascii="Wingdings" w:hAnsi="Wingdings" w:hint="default"/>
+        <w:sz w:val="20"/>
+      </w:rPr>
+    </w:lvl>
+    <w:lvl w:ilvl="6" w:tentative="1">
+      <w:start w:val="1"/>
+      <w:numFmt w:val="bullet"/>
+      <w:lvlText w:val=""/>
+      <w:lvlJc w:val="left"/>
+      <w:pPr>
+        <w:tabs>
+          <w:tab w:val="num" w:pos="5040"/>
+        </w:tabs>
+        <w:ind w:left="5040" w:hanging="360"/>
+      </w:pPr>
+      <w:rPr>
+        <w:rFonts w:ascii="Wingdings" w:hAnsi="Wingdings" w:hint="default"/>
+        <w:sz w:val="20"/>
+      </w:rPr>
+    </w:lvl>
+    <w:lvl w:ilvl="7" w:tentative="1">
+      <w:start w:val="1"/>
+      <w:numFmt w:val="bullet"/>
+      <w:lvlText w:val=""/>
+      <w:lvlJc w:val="left"/>
+      <w:pPr>
+        <w:tabs>
+          <w:tab w:val="num" w:pos="5760"/>
+        </w:tabs>
+        <w:ind w:left="5760" w:hanging="360"/>
+      </w:pPr>
+      <w:rPr>
+        <w:rFonts w:ascii="Wingdings" w:hAnsi="Wingdings" w:hint="default"/>
+        <w:sz w:val="20"/>
+      </w:rPr>
+    </w:lvl>
+    <w:lvl w:ilvl="8" w:tentative="1">
+      <w:start w:val="1"/>
+      <w:numFmt w:val="bullet"/>
+      <w:lvlText w:val=""/>
+      <w:lvlJc w:val="left"/>
+      <w:pPr>
+        <w:tabs>
+          <w:tab w:val="num" w:pos="6480"/>
+        </w:tabs>
+        <w:ind w:left="6480" w:hanging="360"/>
+      </w:pPr>
+      <w:rPr>
+        <w:rFonts w:ascii="Wingdings" w:hAnsi="Wingdings" w:hint="default"/>
+        <w:sz w:val="20"/>
+      </w:rPr>
+    </w:lvl>
+  </w:abstractNum>
+  <w:abstractNum w:abstractNumId="1" w15:restartNumberingAfterBreak="0">
     <w:nsid w:val="2FCC6A32"/>
     <w:multiLevelType w:val="hybridMultilevel"/>
-    <w:tmpl w:val="4F9C78E0"/>
+    <w:tmpl w:val="309AE152"/>
     <w:lvl w:ilvl="0" w:tplc="FD94C642">
       <w:numFmt w:val="bullet"/>
       <w:lvlText w:val="-"/>
@@ -286,10 +1058,397 @@
       </w:pPr>
       <w:rPr>
         <w:rFonts w:ascii="Wingdings" w:hAnsi="Wingdings" w:hint="default"/>
+      </w:rPr>
+    </w:lvl>
+  </w:abstractNum>
+  <w:abstractNum w:abstractNumId="2" w15:restartNumberingAfterBreak="0">
+    <w:nsid w:val="3C0A1786"/>
+    <w:multiLevelType w:val="hybridMultilevel"/>
+    <w:tmpl w:val="B568E458"/>
+    <w:lvl w:ilvl="0" w:tplc="E2D0C9E4">
+      <w:numFmt w:val="bullet"/>
+      <w:lvlText w:val=""/>
+      <w:lvlJc w:val="left"/>
+      <w:pPr>
+        <w:ind w:left="720" w:hanging="360"/>
+      </w:pPr>
+      <w:rPr>
+        <w:rFonts w:ascii="Symbol" w:hAnsi="Symbol" w:cstheme="minorBidi" w:hint="default"/>
+        <w:color w:val="002060"/>
+      </w:rPr>
+    </w:lvl>
+    <w:lvl w:ilvl="1" w:tplc="FFFFFFFF">
+      <w:start w:val="1"/>
+      <w:numFmt w:val="bullet"/>
+      <w:lvlText w:val="o"/>
+      <w:lvlJc w:val="left"/>
+      <w:pPr>
+        <w:ind w:left="1440" w:hanging="360"/>
+      </w:pPr>
+      <w:rPr>
+        <w:rFonts w:ascii="Courier New" w:hAnsi="Courier New" w:cs="Courier New" w:hint="default"/>
+      </w:rPr>
+    </w:lvl>
+    <w:lvl w:ilvl="2" w:tplc="FFFFFFFF" w:tentative="1">
+      <w:start w:val="1"/>
+      <w:numFmt w:val="bullet"/>
+      <w:lvlText w:val=""/>
+      <w:lvlJc w:val="left"/>
+      <w:pPr>
+        <w:ind w:left="2160" w:hanging="360"/>
+      </w:pPr>
+      <w:rPr>
+        <w:rFonts w:ascii="Wingdings" w:hAnsi="Wingdings" w:hint="default"/>
+      </w:rPr>
+    </w:lvl>
+    <w:lvl w:ilvl="3" w:tplc="FFFFFFFF" w:tentative="1">
+      <w:start w:val="1"/>
+      <w:numFmt w:val="bullet"/>
+      <w:lvlText w:val=""/>
+      <w:lvlJc w:val="left"/>
+      <w:pPr>
+        <w:ind w:left="2880" w:hanging="360"/>
+      </w:pPr>
+      <w:rPr>
+        <w:rFonts w:ascii="Symbol" w:hAnsi="Symbol" w:hint="default"/>
+      </w:rPr>
+    </w:lvl>
+    <w:lvl w:ilvl="4" w:tplc="FFFFFFFF" w:tentative="1">
+      <w:start w:val="1"/>
+      <w:numFmt w:val="bullet"/>
+      <w:lvlText w:val="o"/>
+      <w:lvlJc w:val="left"/>
+      <w:pPr>
+        <w:ind w:left="3600" w:hanging="360"/>
+      </w:pPr>
+      <w:rPr>
+        <w:rFonts w:ascii="Courier New" w:hAnsi="Courier New" w:cs="Courier New" w:hint="default"/>
+      </w:rPr>
+    </w:lvl>
+    <w:lvl w:ilvl="5" w:tplc="FFFFFFFF" w:tentative="1">
+      <w:start w:val="1"/>
+      <w:numFmt w:val="bullet"/>
+      <w:lvlText w:val=""/>
+      <w:lvlJc w:val="left"/>
+      <w:pPr>
+        <w:ind w:left="4320" w:hanging="360"/>
+      </w:pPr>
+      <w:rPr>
+        <w:rFonts w:ascii="Wingdings" w:hAnsi="Wingdings" w:hint="default"/>
+      </w:rPr>
+    </w:lvl>
+    <w:lvl w:ilvl="6" w:tplc="FFFFFFFF" w:tentative="1">
+      <w:start w:val="1"/>
+      <w:numFmt w:val="bullet"/>
+      <w:lvlText w:val=""/>
+      <w:lvlJc w:val="left"/>
+      <w:pPr>
+        <w:ind w:left="5040" w:hanging="360"/>
+      </w:pPr>
+      <w:rPr>
+        <w:rFonts w:ascii="Symbol" w:hAnsi="Symbol" w:hint="default"/>
+      </w:rPr>
+    </w:lvl>
+    <w:lvl w:ilvl="7" w:tplc="FFFFFFFF" w:tentative="1">
+      <w:start w:val="1"/>
+      <w:numFmt w:val="bullet"/>
+      <w:lvlText w:val="o"/>
+      <w:lvlJc w:val="left"/>
+      <w:pPr>
+        <w:ind w:left="5760" w:hanging="360"/>
+      </w:pPr>
+      <w:rPr>
+        <w:rFonts w:ascii="Courier New" w:hAnsi="Courier New" w:cs="Courier New" w:hint="default"/>
+      </w:rPr>
+    </w:lvl>
+    <w:lvl w:ilvl="8" w:tplc="FFFFFFFF" w:tentative="1">
+      <w:start w:val="1"/>
+      <w:numFmt w:val="bullet"/>
+      <w:lvlText w:val=""/>
+      <w:lvlJc w:val="left"/>
+      <w:pPr>
+        <w:ind w:left="6480" w:hanging="360"/>
+      </w:pPr>
+      <w:rPr>
+        <w:rFonts w:ascii="Wingdings" w:hAnsi="Wingdings" w:hint="default"/>
+      </w:rPr>
+    </w:lvl>
+  </w:abstractNum>
+  <w:abstractNum w:abstractNumId="3" w15:restartNumberingAfterBreak="0">
+    <w:nsid w:val="687058B5"/>
+    <w:multiLevelType w:val="hybridMultilevel"/>
+    <w:tmpl w:val="D3EC7BE8"/>
+    <w:lvl w:ilvl="0" w:tplc="E2D0C9E4">
+      <w:numFmt w:val="bullet"/>
+      <w:lvlText w:val=""/>
+      <w:lvlJc w:val="left"/>
+      <w:pPr>
+        <w:ind w:left="720" w:hanging="360"/>
+      </w:pPr>
+      <w:rPr>
+        <w:rFonts w:ascii="Symbol" w:hAnsi="Symbol" w:cstheme="minorBidi" w:hint="default"/>
+        <w:color w:val="002060"/>
+      </w:rPr>
+    </w:lvl>
+    <w:lvl w:ilvl="1" w:tplc="04090003" w:tentative="1">
+      <w:start w:val="1"/>
+      <w:numFmt w:val="bullet"/>
+      <w:lvlText w:val="o"/>
+      <w:lvlJc w:val="left"/>
+      <w:pPr>
+        <w:ind w:left="1440" w:hanging="360"/>
+      </w:pPr>
+      <w:rPr>
+        <w:rFonts w:ascii="Courier New" w:hAnsi="Courier New" w:cs="Courier New" w:hint="default"/>
+      </w:rPr>
+    </w:lvl>
+    <w:lvl w:ilvl="2" w:tplc="04090005" w:tentative="1">
+      <w:start w:val="1"/>
+      <w:numFmt w:val="bullet"/>
+      <w:lvlText w:val=""/>
+      <w:lvlJc w:val="left"/>
+      <w:pPr>
+        <w:ind w:left="2160" w:hanging="360"/>
+      </w:pPr>
+      <w:rPr>
+        <w:rFonts w:ascii="Wingdings" w:hAnsi="Wingdings" w:hint="default"/>
+      </w:rPr>
+    </w:lvl>
+    <w:lvl w:ilvl="3" w:tplc="04090001" w:tentative="1">
+      <w:start w:val="1"/>
+      <w:numFmt w:val="bullet"/>
+      <w:lvlText w:val=""/>
+      <w:lvlJc w:val="left"/>
+      <w:pPr>
+        <w:ind w:left="2880" w:hanging="360"/>
+      </w:pPr>
+      <w:rPr>
+        <w:rFonts w:ascii="Symbol" w:hAnsi="Symbol" w:hint="default"/>
+      </w:rPr>
+    </w:lvl>
+    <w:lvl w:ilvl="4" w:tplc="04090003" w:tentative="1">
+      <w:start w:val="1"/>
+      <w:numFmt w:val="bullet"/>
+      <w:lvlText w:val="o"/>
+      <w:lvlJc w:val="left"/>
+      <w:pPr>
+        <w:ind w:left="3600" w:hanging="360"/>
+      </w:pPr>
+      <w:rPr>
+        <w:rFonts w:ascii="Courier New" w:hAnsi="Courier New" w:cs="Courier New" w:hint="default"/>
+      </w:rPr>
+    </w:lvl>
+    <w:lvl w:ilvl="5" w:tplc="04090005" w:tentative="1">
+      <w:start w:val="1"/>
+      <w:numFmt w:val="bullet"/>
+      <w:lvlText w:val=""/>
+      <w:lvlJc w:val="left"/>
+      <w:pPr>
+        <w:ind w:left="4320" w:hanging="360"/>
+      </w:pPr>
+      <w:rPr>
+        <w:rFonts w:ascii="Wingdings" w:hAnsi="Wingdings" w:hint="default"/>
+      </w:rPr>
+    </w:lvl>
+    <w:lvl w:ilvl="6" w:tplc="04090001" w:tentative="1">
+      <w:start w:val="1"/>
+      <w:numFmt w:val="bullet"/>
+      <w:lvlText w:val=""/>
+      <w:lvlJc w:val="left"/>
+      <w:pPr>
+        <w:ind w:left="5040" w:hanging="360"/>
+      </w:pPr>
+      <w:rPr>
+        <w:rFonts w:ascii="Symbol" w:hAnsi="Symbol" w:hint="default"/>
+      </w:rPr>
+    </w:lvl>
+    <w:lvl w:ilvl="7" w:tplc="04090003" w:tentative="1">
+      <w:start w:val="1"/>
+      <w:numFmt w:val="bullet"/>
+      <w:lvlText w:val="o"/>
+      <w:lvlJc w:val="left"/>
+      <w:pPr>
+        <w:ind w:left="5760" w:hanging="360"/>
+      </w:pPr>
+      <w:rPr>
+        <w:rFonts w:ascii="Courier New" w:hAnsi="Courier New" w:cs="Courier New" w:hint="default"/>
+      </w:rPr>
+    </w:lvl>
+    <w:lvl w:ilvl="8" w:tplc="04090005" w:tentative="1">
+      <w:start w:val="1"/>
+      <w:numFmt w:val="bullet"/>
+      <w:lvlText w:val=""/>
+      <w:lvlJc w:val="left"/>
+      <w:pPr>
+        <w:ind w:left="6480" w:hanging="360"/>
+      </w:pPr>
+      <w:rPr>
+        <w:rFonts w:ascii="Wingdings" w:hAnsi="Wingdings" w:hint="default"/>
+      </w:rPr>
+    </w:lvl>
+  </w:abstractNum>
+  <w:abstractNum w:abstractNumId="4" w15:restartNumberingAfterBreak="0">
+    <w:nsid w:val="70621C78"/>
+    <w:multiLevelType w:val="multilevel"/>
+    <w:tmpl w:val="9A9A9780"/>
+    <w:lvl w:ilvl="0">
+      <w:start w:val="1"/>
+      <w:numFmt w:val="bullet"/>
+      <w:lvlText w:val=""/>
+      <w:lvlJc w:val="left"/>
+      <w:pPr>
+        <w:tabs>
+          <w:tab w:val="num" w:pos="720"/>
+        </w:tabs>
+        <w:ind w:left="720" w:hanging="360"/>
+      </w:pPr>
+      <w:rPr>
+        <w:rFonts w:ascii="Symbol" w:hAnsi="Symbol" w:hint="default"/>
+        <w:sz w:val="20"/>
+      </w:rPr>
+    </w:lvl>
+    <w:lvl w:ilvl="1">
+      <w:start w:val="1"/>
+      <w:numFmt w:val="bullet"/>
+      <w:lvlText w:val="o"/>
+      <w:lvlJc w:val="left"/>
+      <w:pPr>
+        <w:tabs>
+          <w:tab w:val="num" w:pos="1440"/>
+        </w:tabs>
+        <w:ind w:left="1440" w:hanging="360"/>
+      </w:pPr>
+      <w:rPr>
+        <w:rFonts w:ascii="Courier New" w:hAnsi="Courier New" w:hint="default"/>
+        <w:sz w:val="20"/>
+      </w:rPr>
+    </w:lvl>
+    <w:lvl w:ilvl="2" w:tentative="1">
+      <w:start w:val="1"/>
+      <w:numFmt w:val="bullet"/>
+      <w:lvlText w:val=""/>
+      <w:lvlJc w:val="left"/>
+      <w:pPr>
+        <w:tabs>
+          <w:tab w:val="num" w:pos="2160"/>
+        </w:tabs>
+        <w:ind w:left="2160" w:hanging="360"/>
+      </w:pPr>
+      <w:rPr>
+        <w:rFonts w:ascii="Wingdings" w:hAnsi="Wingdings" w:hint="default"/>
+        <w:sz w:val="20"/>
+      </w:rPr>
+    </w:lvl>
+    <w:lvl w:ilvl="3" w:tentative="1">
+      <w:start w:val="1"/>
+      <w:numFmt w:val="bullet"/>
+      <w:lvlText w:val=""/>
+      <w:lvlJc w:val="left"/>
+      <w:pPr>
+        <w:tabs>
+          <w:tab w:val="num" w:pos="2880"/>
+        </w:tabs>
+        <w:ind w:left="2880" w:hanging="360"/>
+      </w:pPr>
+      <w:rPr>
+        <w:rFonts w:ascii="Wingdings" w:hAnsi="Wingdings" w:hint="default"/>
+        <w:sz w:val="20"/>
+      </w:rPr>
+    </w:lvl>
+    <w:lvl w:ilvl="4" w:tentative="1">
+      <w:start w:val="1"/>
+      <w:numFmt w:val="bullet"/>
+      <w:lvlText w:val=""/>
+      <w:lvlJc w:val="left"/>
+      <w:pPr>
+        <w:tabs>
+          <w:tab w:val="num" w:pos="3600"/>
+        </w:tabs>
+        <w:ind w:left="3600" w:hanging="360"/>
+      </w:pPr>
+      <w:rPr>
+        <w:rFonts w:ascii="Wingdings" w:hAnsi="Wingdings" w:hint="default"/>
+        <w:sz w:val="20"/>
+      </w:rPr>
+    </w:lvl>
+    <w:lvl w:ilvl="5" w:tentative="1">
+      <w:start w:val="1"/>
+      <w:numFmt w:val="bullet"/>
+      <w:lvlText w:val=""/>
+      <w:lvlJc w:val="left"/>
+      <w:pPr>
+        <w:tabs>
+          <w:tab w:val="num" w:pos="4320"/>
+        </w:tabs>
+        <w:ind w:left="4320" w:hanging="360"/>
+      </w:pPr>
+      <w:rPr>
+        <w:rFonts w:ascii="Wingdings" w:hAnsi="Wingdings" w:hint="default"/>
+        <w:sz w:val="20"/>
+      </w:rPr>
+    </w:lvl>
+    <w:lvl w:ilvl="6" w:tentative="1">
+      <w:start w:val="1"/>
+      <w:numFmt w:val="bullet"/>
+      <w:lvlText w:val=""/>
+      <w:lvlJc w:val="left"/>
+      <w:pPr>
+        <w:tabs>
+          <w:tab w:val="num" w:pos="5040"/>
+        </w:tabs>
+        <w:ind w:left="5040" w:hanging="360"/>
+      </w:pPr>
+      <w:rPr>
+        <w:rFonts w:ascii="Wingdings" w:hAnsi="Wingdings" w:hint="default"/>
+        <w:sz w:val="20"/>
+      </w:rPr>
+    </w:lvl>
+    <w:lvl w:ilvl="7" w:tentative="1">
+      <w:start w:val="1"/>
+      <w:numFmt w:val="bullet"/>
+      <w:lvlText w:val=""/>
+      <w:lvlJc w:val="left"/>
+      <w:pPr>
+        <w:tabs>
+          <w:tab w:val="num" w:pos="5760"/>
+        </w:tabs>
+        <w:ind w:left="5760" w:hanging="360"/>
+      </w:pPr>
+      <w:rPr>
+        <w:rFonts w:ascii="Wingdings" w:hAnsi="Wingdings" w:hint="default"/>
+        <w:sz w:val="20"/>
+      </w:rPr>
+    </w:lvl>
+    <w:lvl w:ilvl="8" w:tentative="1">
+      <w:start w:val="1"/>
+      <w:numFmt w:val="bullet"/>
+      <w:lvlText w:val=""/>
+      <w:lvlJc w:val="left"/>
+      <w:pPr>
+        <w:tabs>
+          <w:tab w:val="num" w:pos="6480"/>
+        </w:tabs>
+        <w:ind w:left="6480" w:hanging="360"/>
+      </w:pPr>
+      <w:rPr>
+        <w:rFonts w:ascii="Wingdings" w:hAnsi="Wingdings" w:hint="default"/>
+        <w:sz w:val="20"/>
       </w:rPr>
     </w:lvl>
   </w:abstractNum>
   <w:num w:numId="1" w16cid:durableId="435827181">
+    <w:abstractNumId w:val="1"/>
+  </w:num>
+  <w:num w:numId="2" w16cid:durableId="456677387">
+    <w:abstractNumId w:val="2"/>
+  </w:num>
+  <w:num w:numId="3" w16cid:durableId="1949048088">
+    <w:abstractNumId w:val="3"/>
+  </w:num>
+  <w:num w:numId="4" w16cid:durableId="1524711767">
+    <w:abstractNumId w:val="4"/>
+  </w:num>
+  <w:num w:numId="5" w16cid:durableId="354892043">
     <w:abstractNumId w:val="0"/>
   </w:num>
 </w:numbering>
@@ -703,7 +1862,7 @@
     <w:link w:val="Heading1Char"/>
     <w:uiPriority w:val="9"/>
     <w:qFormat/>
-    <w:rsid w:val="00F1155B"/>
+    <w:rsid w:val="00A74472"/>
     <w:pPr>
       <w:keepNext/>
       <w:keepLines/>
@@ -711,9 +1870,10 @@
       <w:outlineLvl w:val="0"/>
     </w:pPr>
     <w:rPr>
-      <w:rFonts w:asciiTheme="majorHAnsi" w:eastAsiaTheme="majorEastAsia" w:hAnsiTheme="majorHAnsi" w:cstheme="majorBidi"/>
-      <w:color w:val="2F5496" w:themeColor="accent1" w:themeShade="BF"/>
-      <w:sz w:val="40"/>
+      <w:rFonts w:ascii="Arial Black" w:eastAsiaTheme="majorEastAsia" w:hAnsi="Arial Black" w:cstheme="majorBidi"/>
+      <w:b/>
+      <w:color w:val="000000" w:themeColor="text1"/>
+      <w:sz w:val="36"/>
       <w:szCs w:val="40"/>
     </w:rPr>
   </w:style>
@@ -898,7 +2058,6 @@
   <w:style w:type="character" w:default="1" w:styleId="DefaultParagraphFont">
     <w:name w:val="Default Paragraph Font"/>
     <w:uiPriority w:val="1"/>
-    <w:semiHidden/>
     <w:unhideWhenUsed/>
   </w:style>
   <w:style w:type="table" w:default="1" w:styleId="TableNormal">
@@ -927,11 +2086,12 @@
     <w:basedOn w:val="DefaultParagraphFont"/>
     <w:link w:val="Heading1"/>
     <w:uiPriority w:val="9"/>
-    <w:rsid w:val="00F1155B"/>
-    <w:rPr>
-      <w:rFonts w:asciiTheme="majorHAnsi" w:eastAsiaTheme="majorEastAsia" w:hAnsiTheme="majorHAnsi" w:cstheme="majorBidi"/>
-      <w:color w:val="2F5496" w:themeColor="accent1" w:themeShade="BF"/>
-      <w:sz w:val="40"/>
+    <w:rsid w:val="00A74472"/>
+    <w:rPr>
+      <w:rFonts w:ascii="Arial Black" w:eastAsiaTheme="majorEastAsia" w:hAnsi="Arial Black" w:cstheme="majorBidi"/>
+      <w:b/>
+      <w:color w:val="000000" w:themeColor="text1"/>
+      <w:sz w:val="36"/>
       <w:szCs w:val="40"/>
     </w:rPr>
   </w:style>

</xml_diff>